<commit_message>
add memo system and upload code
</commit_message>
<xml_diff>
--- a/StudentPay/doc/CHAPTER THREE(3).docx
+++ b/StudentPay/doc/CHAPTER THREE(3).docx
@@ -123,14 +123,12 @@
         </w:rPr>
         <w:t xml:space="preserve">To improve accessibility and convenience, Koforidua Technical University later introduced a USSD-based payment system accessible through the </w:t>
       </w:r>
-      <w:proofErr w:type="spellStart"/>
       <w:r>
         <w:rPr>
           <w:rFonts w:ascii="Times New Roman" w:hAnsi="Times New Roman" w:cs="Times New Roman"/>
         </w:rPr>
-        <w:t>shortcode</w:t>
+        <w:t>short code</w:t>
       </w:r>
-      <w:proofErr w:type="spellEnd"/>
       <w:r>
         <w:rPr>
           <w:rFonts w:ascii="Times New Roman" w:hAnsi="Times New Roman" w:cs="Times New Roman"/>
@@ -143,29 +141,59 @@
           <w:i/>
           <w:iCs/>
         </w:rPr>
-        <w:t>776</w:t>
+        <w:t>*776*102</w:t>
       </w:r>
       <w:r>
         <w:rPr>
           <w:rFonts w:ascii="Times New Roman" w:hAnsi="Times New Roman" w:cs="Times New Roman"/>
         </w:rPr>
-        <w:t xml:space="preserve">123#. The system enables </w:t>
+        <w:t xml:space="preserve"># </w:t>
       </w:r>
       <w:r>
         <w:rPr>
           <w:rFonts w:ascii="Times New Roman" w:hAnsi="Times New Roman" w:cs="Times New Roman"/>
         </w:rPr>
+        <w:t xml:space="preserve">or </w:t>
+      </w:r>
+      <w:r>
+        <w:rPr>
+          <w:rFonts w:ascii="Times New Roman" w:hAnsi="Times New Roman" w:cs="Times New Roman"/>
+          <w:i/>
+          <w:iCs/>
+        </w:rPr>
+        <w:t>*776*123</w:t>
+      </w:r>
+      <w:r>
+        <w:rPr>
+          <w:rFonts w:ascii="Times New Roman" w:hAnsi="Times New Roman" w:cs="Times New Roman"/>
+        </w:rPr>
+        <w:t>#</w:t>
+      </w:r>
+      <w:r>
+        <w:rPr>
+          <w:rFonts w:ascii="Times New Roman" w:hAnsi="Times New Roman" w:cs="Times New Roman"/>
+        </w:rPr>
+        <w:t xml:space="preserve">. </w:t>
+      </w:r>
+      <w:r>
+        <w:rPr>
+          <w:rFonts w:ascii="Times New Roman" w:hAnsi="Times New Roman" w:cs="Times New Roman"/>
+        </w:rPr>
+        <w:t xml:space="preserve">The </w:t>
+      </w:r>
+      <w:r>
+        <w:rPr>
+          <w:rFonts w:ascii="Times New Roman" w:hAnsi="Times New Roman" w:cs="Times New Roman"/>
+        </w:rPr>
         <w:lastRenderedPageBreak/>
-        <w:t xml:space="preserve">students to pay tuition fees, hostel fees, transcript fees, </w:t>
+        <w:t xml:space="preserve">system enables students to pay tuition fees, hostel fees, transcript fees, </w:t>
       </w:r>
-      <w:proofErr w:type="spellStart"/>
       <w:r>
         <w:rPr>
           <w:rFonts w:ascii="Times New Roman" w:hAnsi="Times New Roman" w:cs="Times New Roman"/>
         </w:rPr>
-        <w:t>resit</w:t>
+        <w:t>reseat</w:t>
       </w:r>
-      <w:proofErr w:type="spellEnd"/>
       <w:r>
         <w:rPr>
           <w:rFonts w:ascii="Times New Roman" w:hAnsi="Times New Roman" w:cs="Times New Roman"/>
@@ -244,14 +272,12 @@
         </w:rPr>
         <w:t xml:space="preserve">The current payment system used by Koforidua Technical University is based on Unstructured Supplementary Service Data (USSD) technology. The system enables students to make fee payments using a mobile </w:t>
       </w:r>
-      <w:proofErr w:type="spellStart"/>
       <w:r>
         <w:rPr>
           <w:rFonts w:ascii="Times New Roman" w:hAnsi="Times New Roman" w:cs="Times New Roman"/>
         </w:rPr>
-        <w:t>shortcode</w:t>
+        <w:t>short code</w:t>
       </w:r>
-      <w:proofErr w:type="spellEnd"/>
       <w:r>
         <w:rPr>
           <w:rFonts w:ascii="Times New Roman" w:hAnsi="Times New Roman" w:cs="Times New Roman"/>
@@ -272,14 +298,12 @@
         </w:rPr>
         <w:t xml:space="preserve">Students access the system by dialing the </w:t>
       </w:r>
-      <w:proofErr w:type="spellStart"/>
       <w:r>
         <w:rPr>
           <w:rFonts w:ascii="Times New Roman" w:hAnsi="Times New Roman" w:cs="Times New Roman"/>
         </w:rPr>
-        <w:t>shortcode</w:t>
+        <w:t>short code</w:t>
       </w:r>
-      <w:proofErr w:type="spellEnd"/>
       <w:r>
         <w:rPr>
           <w:rFonts w:ascii="Times New Roman" w:hAnsi="Times New Roman" w:cs="Times New Roman"/>
@@ -312,15 +336,7 @@
           <w:i/>
           <w:iCs/>
         </w:rPr>
-        <w:t>*776*12</w:t>
-      </w:r>
-      <w:r>
-        <w:rPr>
-          <w:rFonts w:ascii="Times New Roman" w:hAnsi="Times New Roman" w:cs="Times New Roman"/>
-          <w:i/>
-          <w:iCs/>
-        </w:rPr>
-        <w:t>3</w:t>
+        <w:t>*776*123</w:t>
       </w:r>
       <w:r>
         <w:rPr>
@@ -433,14 +449,12 @@
         </w:rPr>
         <w:t xml:space="preserve">The student dials the USSD </w:t>
       </w:r>
-      <w:proofErr w:type="spellStart"/>
       <w:r>
         <w:rPr>
           <w:rFonts w:ascii="Times New Roman" w:hAnsi="Times New Roman" w:cs="Times New Roman"/>
         </w:rPr>
-        <w:t>shortcode</w:t>
+        <w:t>short code</w:t>
       </w:r>
-      <w:proofErr w:type="spellEnd"/>
       <w:r>
         <w:rPr>
           <w:rFonts w:ascii="Times New Roman" w:hAnsi="Times New Roman" w:cs="Times New Roman"/>
@@ -737,14 +751,12 @@
         </w:rPr>
         <w:t xml:space="preserve">This is the user interaction layer where students dial the USSD </w:t>
       </w:r>
-      <w:proofErr w:type="spellStart"/>
       <w:r>
         <w:rPr>
           <w:rFonts w:ascii="Times New Roman" w:hAnsi="Times New Roman" w:cs="Times New Roman"/>
         </w:rPr>
-        <w:t>shortcode</w:t>
+        <w:t>short code</w:t>
       </w:r>
-      <w:proofErr w:type="spellEnd"/>
       <w:r>
         <w:rPr>
           <w:rFonts w:ascii="Times New Roman" w:hAnsi="Times New Roman" w:cs="Times New Roman"/>

</xml_diff>